<commit_message>
docs: atualizar referências ANVISA → ChatBulário nos manuais
</commit_message>
<xml_diff>
--- a/docs/RELATORIO_TECNICO_PARA_EQUIPE.docx
+++ b/docs/RELATORIO_TECNICO_PARA_EQUIPE.docx
@@ -2759,7 +2759,7 @@
                 <w:b/>
                 <w:sz w:val="18"/>
               </w:rPr>
-              <w:t>ANVISA Medicamentos</w:t>
+              <w:t>ChatBulário</w:t>
             </w:r>
           </w:p>
         </w:tc>
@@ -2777,7 +2777,7 @@
               <w:rPr>
                 <w:sz w:val="18"/>
               </w:rPr>
-              <w:t>dados.anvisa.gov.br</w:t>
+              <w:t>HuggingFace</w:t>
             </w:r>
           </w:p>
         </w:tc>
@@ -2813,7 +2813,7 @@
               <w:rPr>
                 <w:sz w:val="18"/>
               </w:rPr>
-              <w:t>43.445</w:t>
+              <w:t>68.938 → 10.000 indexados</w:t>
             </w:r>
           </w:p>
         </w:tc>
@@ -3106,10 +3106,29 @@
         <w:rPr>
           <w:b/>
         </w:rPr>
-        <w:t>ANVISA</w:t>
-      </w:r>
-      <w:r>
-        <w:t>: único dataset público brasileiro de bulas. Necessário para PT-BR.</w:t>
+        <w:t>ChatBulário</w:t>
+      </w:r>
+      <w:r>
+        <w:t xml:space="preserve"> (substituiu </w:t>
+      </w:r>
+      <w:r>
+        <w:rPr>
+          <w:rFonts w:ascii="Consolas" w:hAnsi="Consolas"/>
+          <w:sz w:val="20"/>
+        </w:rPr>
+        <w:t>anvisa_medicamentos.csv</w:t>
+      </w:r>
+      <w:r>
+        <w:t xml:space="preserve">): único dataset público brasileiro de </w:t>
+      </w:r>
+      <w:r>
+        <w:rPr>
+          <w:b/>
+        </w:rPr>
+        <w:t>bulas estruturadas</w:t>
+      </w:r>
+      <w:r>
+        <w:t xml:space="preserve"> em formato Q&amp;A. Necessário para PT-BR.</w:t>
       </w:r>
     </w:p>
     <w:p>
@@ -13130,7 +13149,7 @@
               <w:rPr>
                 <w:sz w:val="18"/>
               </w:rPr>
-              <w:t>Indexação ChromaDB (3 vector stores)</w:t>
+              <w:t>Indexação ChromaDB (3 vector stores: ChatBulário + CID-10 + Synthetic)</w:t>
             </w:r>
           </w:p>
         </w:tc>

</xml_diff>